<commit_message>
Việc 57853: gắn đúng mã hồ sơ + mã phiếu xuất cho đơn thuốc đính kèm (EMR_DOCUMENT.EXP_MEST_CODE)
- DocumentTDO.TreatmentCode = TDL_TREATMENT_CODE (bán vãng lai -> EXP_MEST_CODE), giữ IsOutsideTreatment
- HIS_CODE thêm khối chuẩn |EXP_MEST_CODE:x|EXP_STOCK:y|REQ_DEPT:z để EMR HisCodeStockParser
  ghi EMR_DOCUMENT.EXP_MEST_CODE / EXP_MEDI_STOCK_CODE / REQ_DEPARTMENT_CODE (trước đây NULL)
- Danh sách đơn + đánh dấu: lọc TREATMENT_CODEs = mã hồ sơ + mã phiếu, khớp theo EXP_MEST_CODE
  (fallback tách từ HIS_CODE) -> tài liệu tạo trước vẫn nhận ra
- Cập nhật docs

Co-Authored-By: Claude Opus 5.5 <noreply@anthropic.com>
</commit_message>
<xml_diff>
--- a/docs/57853_PhanTich_DinhKemDonThuocXuatBan.docx
+++ b/docs/57853_PhanTich_DinhKemDonThuocXuatBan.docx
@@ -2776,9 +2776,9 @@
         </w:tblBorders>
       </w:tblPr>
       <w:tblGrid>
-        <w:gridCol w:w="1276"/>
-        <w:gridCol w:w="3893"/>
-        <w:gridCol w:w="4469"/>
+        <w:gridCol w:w="1204"/>
+        <w:gridCol w:w="4216"/>
+        <w:gridCol w:w="4218"/>
       </w:tblGrid>
       <w:tr>
         <w:trPr>
@@ -2786,7 +2786,7 @@
         </w:trPr>
         <w:tc>
           <w:tcPr>
-            <w:tcW w:type="dxa" w:w="1276"/>
+            <w:tcW w:type="dxa" w:w="1204"/>
             <w:tcBorders>
               <w:top w:val="single" w:color="999999" w:sz="4"/>
               <w:left w:val="single" w:color="999999" w:sz="4"/>
@@ -2816,7 +2816,7 @@
         </w:tc>
         <w:tc>
           <w:tcPr>
-            <w:tcW w:type="dxa" w:w="3893"/>
+            <w:tcW w:type="dxa" w:w="4216"/>
             <w:tcBorders>
               <w:top w:val="single" w:color="999999" w:sz="4"/>
               <w:left w:val="single" w:color="999999" w:sz="4"/>
@@ -2846,7 +2846,7 @@
         </w:tc>
         <w:tc>
           <w:tcPr>
-            <w:tcW w:type="dxa" w:w="4469"/>
+            <w:tcW w:type="dxa" w:w="4218"/>
             <w:tcBorders>
               <w:top w:val="single" w:color="999999" w:sz="4"/>
               <w:left w:val="single" w:color="999999" w:sz="4"/>
@@ -2881,7 +2881,7 @@
         </w:trPr>
         <w:tc>
           <w:tcPr>
-            <w:tcW w:type="dxa" w:w="1276"/>
+            <w:tcW w:type="dxa" w:w="1204"/>
             <w:tcBorders>
               <w:top w:val="single" w:color="999999" w:sz="4"/>
               <w:left w:val="single" w:color="999999" w:sz="4"/>
@@ -2909,7 +2909,7 @@
         </w:tc>
         <w:tc>
           <w:tcPr>
-            <w:tcW w:type="dxa" w:w="3893"/>
+            <w:tcW w:type="dxa" w:w="4216"/>
             <w:tcBorders>
               <w:top w:val="single" w:color="999999" w:sz="4"/>
               <w:left w:val="single" w:color="999999" w:sz="4"/>
@@ -2931,13 +2931,38 @@
                 <w:sz w:val="22"/>
                 <w:szCs w:val="22"/>
               </w:rPr>
+              <w:t xml:space="preserve">TDL_TREATMENT_CODE</w:t>
+            </w:r>
+            <w:r>
+              <w:rPr>
+                <w:rFonts w:ascii="Times New Roman" w:cs="Times New Roman" w:eastAsia="Times New Roman" w:hAnsi="Times New Roman"/>
+                <w:sz w:val="22"/>
+                <w:szCs w:val="22"/>
+              </w:rPr>
+              <w:t xml:space="preserve"> (vãng lai → </w:t>
+            </w:r>
+            <w:r>
+              <w:rPr>
+                <w:rFonts w:ascii="Consolas" w:cs="Consolas" w:eastAsia="Consolas" w:hAnsi="Consolas"/>
+                <w:color w:val="A31515"/>
+                <w:sz w:val="22"/>
+                <w:szCs w:val="22"/>
+              </w:rPr>
               <w:t xml:space="preserve">EXP_MEST_CODE</w:t>
             </w:r>
-          </w:p>
-        </w:tc>
-        <w:tc>
-          <w:tcPr>
-            <w:tcW w:type="dxa" w:w="4469"/>
+            <w:r>
+              <w:rPr>
+                <w:rFonts w:ascii="Times New Roman" w:cs="Times New Roman" w:eastAsia="Times New Roman" w:hAnsi="Times New Roman"/>
+                <w:sz w:val="22"/>
+                <w:szCs w:val="22"/>
+              </w:rPr>
+              <w:t xml:space="preserve">) — *cập nhật 02/10/2026*</w:t>
+            </w:r>
+          </w:p>
+        </w:tc>
+        <w:tc>
+          <w:tcPr>
+            <w:tcW w:type="dxa" w:w="4218"/>
             <w:tcBorders>
               <w:top w:val="single" w:color="999999" w:sz="4"/>
               <w:left w:val="single" w:color="999999" w:sz="4"/>
@@ -3002,7 +3027,7 @@
         </w:trPr>
         <w:tc>
           <w:tcPr>
-            <w:tcW w:type="dxa" w:w="1276"/>
+            <w:tcW w:type="dxa" w:w="1204"/>
             <w:tcBorders>
               <w:top w:val="single" w:color="999999" w:sz="4"/>
               <w:left w:val="single" w:color="999999" w:sz="4"/>
@@ -3030,56 +3055,55 @@
         </w:tc>
         <w:tc>
           <w:tcPr>
-            <w:tcW w:type="dxa" w:w="3893"/>
-            <w:tcBorders>
-              <w:top w:val="single" w:color="999999" w:sz="4"/>
-              <w:left w:val="single" w:color="999999" w:sz="4"/>
-              <w:bottom w:val="single" w:color="999999" w:sz="4"/>
-              <w:right w:val="single" w:color="999999" w:sz="4"/>
-            </w:tcBorders>
-            <w:tcMar>
-              <w:top w:type="dxa" w:w="60"/>
-              <w:left w:type="dxa" w:w="100"/>
-              <w:bottom w:type="dxa" w:w="60"/>
-              <w:right w:type="dxa" w:w="100"/>
-            </w:tcMar>
-          </w:tcPr>
-          <w:p>
-            <w:r>
-              <w:rPr>
-                <w:rFonts w:ascii="Consolas" w:cs="Consolas" w:eastAsia="Consolas" w:hAnsi="Consolas"/>
-                <w:color w:val="A31515"/>
-                <w:sz w:val="22"/>
-                <w:szCs w:val="22"/>
-              </w:rPr>
-              <w:t xml:space="preserve">"{MaSite} EXP_MEST_CODE:{code} PRES:{TDL_SERVICE_REQ_CODE}"</w:t>
-            </w:r>
-          </w:p>
-        </w:tc>
-        <w:tc>
-          <w:tcPr>
-            <w:tcW w:type="dxa" w:w="4469"/>
-            <w:tcBorders>
-              <w:top w:val="single" w:color="999999" w:sz="4"/>
-              <w:left w:val="single" w:color="999999" w:sz="4"/>
-              <w:bottom w:val="single" w:color="999999" w:sz="4"/>
-              <w:right w:val="single" w:color="999999" w:sz="4"/>
-            </w:tcBorders>
-            <w:tcMar>
-              <w:top w:type="dxa" w:w="60"/>
-              <w:left w:type="dxa" w:w="100"/>
-              <w:bottom w:type="dxa" w:w="60"/>
-              <w:right w:type="dxa" w:w="100"/>
-            </w:tcMar>
-          </w:tcPr>
-          <w:p>
-            <w:r>
-              <w:rPr>
-                <w:rFonts w:ascii="Times New Roman" w:cs="Times New Roman" w:eastAsia="Times New Roman" w:hAnsi="Times New Roman"/>
-                <w:sz w:val="22"/>
-                <w:szCs w:val="22"/>
-              </w:rPr>
-              <w:t xml:space="preserve">Tra cứu chính xác từng phiếu</w:t>
+            <w:tcW w:type="dxa" w:w="4216"/>
+            <w:tcBorders>
+              <w:top w:val="single" w:color="999999" w:sz="4"/>
+              <w:left w:val="single" w:color="999999" w:sz="4"/>
+              <w:bottom w:val="single" w:color="999999" w:sz="4"/>
+              <w:right w:val="single" w:color="999999" w:sz="4"/>
+            </w:tcBorders>
+            <w:tcMar>
+              <w:top w:type="dxa" w:w="60"/>
+              <w:left w:type="dxa" w:w="100"/>
+              <w:bottom w:type="dxa" w:w="60"/>
+              <w:right w:type="dxa" w:w="100"/>
+            </w:tcMar>
+          </w:tcPr>
+          <w:p>
+            <w:r>
+              <w:rPr>
+                <w:rFonts w:ascii="Times New Roman" w:cs="Times New Roman" w:eastAsia="Times New Roman" w:hAnsi="Times New Roman"/>
+                <w:sz w:val="22"/>
+                <w:szCs w:val="22"/>
+              </w:rPr>
+              <w:t xml:space="preserve">`"{MaSite} EXP_MEST_CODE:{code} SERVICE_REQ_CODE:{mã đơn}</w:t>
+            </w:r>
+          </w:p>
+        </w:tc>
+        <w:tc>
+          <w:tcPr>
+            <w:tcW w:type="dxa" w:w="4218"/>
+            <w:tcBorders>
+              <w:top w:val="single" w:color="999999" w:sz="4"/>
+              <w:left w:val="single" w:color="999999" w:sz="4"/>
+              <w:bottom w:val="single" w:color="999999" w:sz="4"/>
+              <w:right w:val="single" w:color="999999" w:sz="4"/>
+            </w:tcBorders>
+            <w:tcMar>
+              <w:top w:type="dxa" w:w="60"/>
+              <w:left w:type="dxa" w:w="100"/>
+              <w:bottom w:type="dxa" w:w="60"/>
+              <w:right w:type="dxa" w:w="100"/>
+            </w:tcMar>
+          </w:tcPr>
+          <w:p>
+            <w:r>
+              <w:rPr>
+                <w:rFonts w:ascii="Times New Roman" w:cs="Times New Roman" w:eastAsia="Times New Roman" w:hAnsi="Times New Roman"/>
+                <w:sz w:val="22"/>
+                <w:szCs w:val="22"/>
+              </w:rPr>
+              <w:t xml:space="preserve">EXP_MEST_CODE:{code}</w:t>
             </w:r>
           </w:p>
         </w:tc>
@@ -3090,7 +3114,7 @@
         </w:trPr>
         <w:tc>
           <w:tcPr>
-            <w:tcW w:type="dxa" w:w="1276"/>
+            <w:tcW w:type="dxa" w:w="1204"/>
             <w:tcBorders>
               <w:top w:val="single" w:color="999999" w:sz="4"/>
               <w:left w:val="single" w:color="999999" w:sz="4"/>
@@ -3118,7 +3142,7 @@
         </w:tc>
         <w:tc>
           <w:tcPr>
-            <w:tcW w:type="dxa" w:w="3893"/>
+            <w:tcW w:type="dxa" w:w="4216"/>
             <w:tcBorders>
               <w:top w:val="single" w:color="999999" w:sz="4"/>
               <w:left w:val="single" w:color="999999" w:sz="4"/>
@@ -3154,7 +3178,7 @@
         </w:tc>
         <w:tc>
           <w:tcPr>
-            <w:tcW w:type="dxa" w:w="4469"/>
+            <w:tcW w:type="dxa" w:w="4218"/>
             <w:tcBorders>
               <w:top w:val="single" w:color="999999" w:sz="4"/>
               <w:left w:val="single" w:color="999999" w:sz="4"/>
@@ -3186,7 +3210,7 @@
         </w:trPr>
         <w:tc>
           <w:tcPr>
-            <w:tcW w:type="dxa" w:w="1276"/>
+            <w:tcW w:type="dxa" w:w="1204"/>
             <w:tcBorders>
               <w:top w:val="single" w:color="999999" w:sz="4"/>
               <w:left w:val="single" w:color="999999" w:sz="4"/>
@@ -3214,7 +3238,7 @@
         </w:tc>
         <w:tc>
           <w:tcPr>
-            <w:tcW w:type="dxa" w:w="3893"/>
+            <w:tcW w:type="dxa" w:w="4216"/>
             <w:tcBorders>
               <w:top w:val="single" w:color="999999" w:sz="4"/>
               <w:left w:val="single" w:color="999999" w:sz="4"/>
@@ -3242,7 +3266,7 @@
         </w:tc>
         <w:tc>
           <w:tcPr>
-            <w:tcW w:type="dxa" w:w="4469"/>
+            <w:tcW w:type="dxa" w:w="4218"/>
             <w:tcBorders>
               <w:top w:val="single" w:color="999999" w:sz="4"/>
               <w:left w:val="single" w:color="999999" w:sz="4"/>
@@ -3274,7 +3298,7 @@
         </w:trPr>
         <w:tc>
           <w:tcPr>
-            <w:tcW w:type="dxa" w:w="1276"/>
+            <w:tcW w:type="dxa" w:w="1204"/>
             <w:tcBorders>
               <w:top w:val="single" w:color="999999" w:sz="4"/>
               <w:left w:val="single" w:color="999999" w:sz="4"/>
@@ -3302,7 +3326,7 @@
         </w:tc>
         <w:tc>
           <w:tcPr>
-            <w:tcW w:type="dxa" w:w="3893"/>
+            <w:tcW w:type="dxa" w:w="4216"/>
             <w:tcBorders>
               <w:top w:val="single" w:color="999999" w:sz="4"/>
               <w:left w:val="single" w:color="999999" w:sz="4"/>
@@ -3330,7 +3354,7 @@
         </w:tc>
         <w:tc>
           <w:tcPr>
-            <w:tcW w:type="dxa" w:w="4469"/>
+            <w:tcW w:type="dxa" w:w="4218"/>
             <w:tcBorders>
               <w:top w:val="single" w:color="999999" w:sz="4"/>
               <w:left w:val="single" w:color="999999" w:sz="4"/>

</xml_diff>